<commit_message>
Adding new one documents
</commit_message>
<xml_diff>
--- a/public/mainresources/code of conduct.docx
+++ b/public/mainresources/code of conduct.docx
@@ -3,6 +3,9 @@
 <w:document xmlns:wpc="http://schemas.microsoft.com/office/word/2010/wordprocessingCanvas" xmlns:cx="http://schemas.microsoft.com/office/drawing/2014/chartex" xmlns:cx1="http://schemas.microsoft.com/office/drawing/2015/9/8/chartex" xmlns:cx2="http://schemas.microsoft.com/office/drawing/2015/10/21/chartex" xmlns:cx3="http://schemas.microsoft.com/office/drawing/2016/5/9/chartex" xmlns:cx4="http://schemas.microsoft.com/office/drawing/2016/5/10/chartex" xmlns:cx5="http://schemas.microsoft.com/office/drawing/2016/5/11/chartex" xmlns:cx6="http://schemas.microsoft.com/office/drawing/2016/5/12/chartex" xmlns:cx7="http://schemas.microsoft.com/office/drawing/2016/5/13/chartex" xmlns:cx8="http://schemas.microsoft.com/office/drawing/2016/5/14/chartex" xmlns:mc="http://schemas.openxmlformats.org/markup-compatibility/2006" xmlns:aink="http://schemas.microsoft.com/office/drawing/2016/ink" xmlns:am3d="http://schemas.microsoft.com/office/drawing/2017/model3d" xmlns:o="urn:schemas-microsoft-com:office:office" xmlns:oel="http://schemas.microsoft.com/office/2019/extlst" xmlns:r="http://schemas.openxmlformats.org/officeDocument/2006/relationships" xmlns:m="http://schemas.openxmlformats.org/officeDocument/2006/math" xmlns:v="urn:schemas-microsoft-com:vml" xmlns:wp14="http://schemas.microsoft.com/office/word/2010/wordprocessingDrawing" xmlns:wp="http://schemas.openxmlformats.org/drawingml/2006/wordprocessingDrawing" xmlns:w10="urn:schemas-microsoft-com:office:word" xmlns:w="http://schemas.openxmlformats.org/wordprocessingml/2006/main" xmlns:w14="http://schemas.microsoft.com/office/word/2010/wordml" xmlns:w15="http://schemas.microsoft.com/office/word/2012/wordml" xmlns:w16cex="http://schemas.microsoft.com/office/word/2018/wordml/cex" xmlns:w16cid="http://schemas.microsoft.com/office/word/2016/wordml/cid" xmlns:w16="http://schemas.microsoft.com/office/word/2018/wordml" xmlns:w16du="http://schemas.microsoft.com/office/word/2023/wordml/word16du" xmlns:w16sdtdh="http://schemas.microsoft.com/office/word/2020/wordml/sdtdatahash" xmlns:w16sdtfl="http://schemas.microsoft.com/office/word/2024/wordml/sdtformatlock" xmlns:w16se="http://schemas.microsoft.com/office/word/2015/wordml/symex" xmlns:wpg="http://schemas.microsoft.com/office/word/2010/wordprocessingGroup" xmlns:wpi="http://schemas.microsoft.com/office/word/2010/wordprocessingInk" xmlns:wne="http://schemas.microsoft.com/office/word/2006/wordml" xmlns:wps="http://schemas.microsoft.com/office/word/2010/wordprocessingShape" mc:Ignorable="w14 w15 w16se w16cid w16 w16cex w16sdtdh w16sdtfl w16du wp14">
   <w:body>
     <w:p>
+      <w:pPr>
+        <w:jc w:val="both"/>
+      </w:pPr>
       <w:r>
         <w:rPr>
           <w:noProof/>
@@ -59,6 +62,7 @@
     </w:p>
     <w:p>
       <w:pPr>
+        <w:jc w:val="both"/>
         <w:rPr>
           <w:b/>
           <w:bCs/>
@@ -74,6 +78,7 @@
     </w:p>
     <w:p>
       <w:pPr>
+        <w:jc w:val="both"/>
         <w:rPr>
           <w:b/>
           <w:bCs/>
@@ -88,6 +93,9 @@
       </w:r>
     </w:p>
     <w:p>
+      <w:pPr>
+        <w:jc w:val="both"/>
+      </w:pPr>
       <w:r>
         <w:t xml:space="preserve">KBT </w:t>
       </w:r>
@@ -101,6 +109,9 @@
       </w:r>
     </w:p>
     <w:p>
+      <w:pPr>
+        <w:jc w:val="both"/>
+      </w:pPr>
       <w:r>
         <w:t xml:space="preserve">This Code of Conduct defines expected </w:t>
       </w:r>
@@ -112,14 +123,18 @@
       </w:r>
     </w:p>
     <w:p>
+      <w:pPr>
+        <w:jc w:val="both"/>
+      </w:pPr>
       <w:r>
         <w:pict w14:anchorId="2A4A51BE">
-          <v:rect id="_x0000_i1165" style="width:0;height:1.5pt" o:hralign="center" o:hrstd="t" o:hr="t" fillcolor="#a0a0a0" stroked="f"/>
+          <v:rect id="_x0000_i1025" style="width:0;height:1.5pt" o:hralign="center" o:hrstd="t" o:hr="t" fillcolor="#a0a0a0" stroked="f"/>
         </w:pict>
       </w:r>
     </w:p>
     <w:p>
       <w:pPr>
+        <w:jc w:val="both"/>
         <w:rPr>
           <w:b/>
           <w:bCs/>
@@ -143,6 +158,9 @@
       <w:proofErr w:type="spellEnd"/>
     </w:p>
     <w:p>
+      <w:pPr>
+        <w:jc w:val="both"/>
+      </w:pPr>
       <w:r>
         <w:t>All participants, mentors, judges, volunteers, and organizers are expected to:</w:t>
       </w:r>
@@ -153,6 +171,7 @@
           <w:ilvl w:val="0"/>
           <w:numId w:val="19"/>
         </w:numPr>
+        <w:jc w:val="both"/>
       </w:pPr>
       <w:r>
         <w:t>Treat everyone with respect, dignity, and fairness.</w:t>
@@ -164,6 +183,7 @@
           <w:ilvl w:val="0"/>
           <w:numId w:val="19"/>
         </w:numPr>
+        <w:jc w:val="both"/>
       </w:pPr>
       <w:r>
         <w:t>Communicate professionally and courteously.</w:t>
@@ -175,6 +195,7 @@
           <w:ilvl w:val="0"/>
           <w:numId w:val="19"/>
         </w:numPr>
+        <w:jc w:val="both"/>
       </w:pPr>
       <w:r>
         <w:t>Be open to diverse viewpoints and ideas.</w:t>
@@ -186,6 +207,7 @@
           <w:ilvl w:val="0"/>
           <w:numId w:val="19"/>
         </w:numPr>
+        <w:jc w:val="both"/>
       </w:pPr>
       <w:r>
         <w:t>Maintain honesty and academic integrity.</w:t>
@@ -197,6 +219,7 @@
           <w:ilvl w:val="0"/>
           <w:numId w:val="19"/>
         </w:numPr>
+        <w:jc w:val="both"/>
       </w:pPr>
       <w:r>
         <w:t>Follow all instructions and guidelines provided by the organizing committee.</w:t>
@@ -208,20 +231,25 @@
           <w:ilvl w:val="0"/>
           <w:numId w:val="19"/>
         </w:numPr>
+        <w:jc w:val="both"/>
       </w:pPr>
       <w:r>
         <w:t>Work collaboratively and responsibly within their teams.</w:t>
       </w:r>
     </w:p>
     <w:p>
+      <w:pPr>
+        <w:jc w:val="both"/>
+      </w:pPr>
       <w:r>
         <w:pict w14:anchorId="002EADA9">
-          <v:rect id="_x0000_i1166" style="width:0;height:1.5pt" o:hralign="center" o:hrstd="t" o:hr="t" fillcolor="#a0a0a0" stroked="f"/>
+          <v:rect id="_x0000_i1026" style="width:0;height:1.5pt" o:hralign="center" o:hrstd="t" o:hr="t" fillcolor="#a0a0a0" stroked="f"/>
         </w:pict>
       </w:r>
     </w:p>
     <w:p>
       <w:pPr>
+        <w:jc w:val="both"/>
         <w:rPr>
           <w:b/>
           <w:bCs/>
@@ -245,6 +273,9 @@
       <w:proofErr w:type="spellEnd"/>
     </w:p>
     <w:p>
+      <w:pPr>
+        <w:jc w:val="both"/>
+      </w:pPr>
       <w:r>
         <w:t xml:space="preserve">The following </w:t>
       </w:r>
@@ -263,6 +294,7 @@
           <w:ilvl w:val="0"/>
           <w:numId w:val="20"/>
         </w:numPr>
+        <w:jc w:val="both"/>
       </w:pPr>
       <w:r>
         <w:t>Harassment, discrimination, or intimidation in any form.</w:t>
@@ -274,6 +306,7 @@
           <w:ilvl w:val="0"/>
           <w:numId w:val="20"/>
         </w:numPr>
+        <w:jc w:val="both"/>
       </w:pPr>
       <w:r>
         <w:t>Offensive remarks related to gender, religion, caste, race, region, or background.</w:t>
@@ -285,6 +318,7 @@
           <w:ilvl w:val="0"/>
           <w:numId w:val="20"/>
         </w:numPr>
+        <w:jc w:val="both"/>
       </w:pPr>
       <w:r>
         <w:t>Plagiarism, copying, cheating, or misrepresentation of work.</w:t>
@@ -296,6 +330,7 @@
           <w:ilvl w:val="0"/>
           <w:numId w:val="20"/>
         </w:numPr>
+        <w:jc w:val="both"/>
       </w:pPr>
       <w:r>
         <w:t xml:space="preserve">Disruptive </w:t>
@@ -315,6 +350,7 @@
           <w:ilvl w:val="0"/>
           <w:numId w:val="20"/>
         </w:numPr>
+        <w:jc w:val="both"/>
       </w:pPr>
       <w:r>
         <w:t>Use of abusive language or inappropriate content.</w:t>
@@ -326,20 +362,25 @@
           <w:ilvl w:val="0"/>
           <w:numId w:val="20"/>
         </w:numPr>
+        <w:jc w:val="both"/>
       </w:pPr>
       <w:r>
         <w:t>Any form of misconduct affecting other participants or event management.</w:t>
       </w:r>
     </w:p>
     <w:p>
+      <w:pPr>
+        <w:jc w:val="both"/>
+      </w:pPr>
       <w:r>
         <w:pict w14:anchorId="19C8D263">
-          <v:rect id="_x0000_i1167" style="width:0;height:1.5pt" o:hralign="center" o:hrstd="t" o:hr="t" fillcolor="#a0a0a0" stroked="f"/>
+          <v:rect id="_x0000_i1027" style="width:0;height:1.5pt" o:hralign="center" o:hrstd="t" o:hr="t" fillcolor="#a0a0a0" stroked="f"/>
         </w:pict>
       </w:r>
     </w:p>
     <w:p>
       <w:pPr>
+        <w:jc w:val="both"/>
         <w:rPr>
           <w:b/>
           <w:bCs/>
@@ -359,6 +400,7 @@
           <w:ilvl w:val="0"/>
           <w:numId w:val="21"/>
         </w:numPr>
+        <w:jc w:val="both"/>
       </w:pPr>
       <w:r>
         <w:t>All projects must be original and developed during hackathon hours.</w:t>
@@ -370,6 +412,7 @@
           <w:ilvl w:val="0"/>
           <w:numId w:val="21"/>
         </w:numPr>
+        <w:jc w:val="both"/>
       </w:pPr>
       <w:r>
         <w:t>Pre-built or previously submitted projects are strictly prohibited.</w:t>
@@ -381,6 +424,7 @@
           <w:ilvl w:val="0"/>
           <w:numId w:val="21"/>
         </w:numPr>
+        <w:jc w:val="both"/>
       </w:pPr>
       <w:r>
         <w:lastRenderedPageBreak/>
@@ -393,20 +437,25 @@
           <w:ilvl w:val="0"/>
           <w:numId w:val="21"/>
         </w:numPr>
+        <w:jc w:val="both"/>
       </w:pPr>
       <w:r>
         <w:t>Violation of intellectual property rights will lead to immediate disqualification.</w:t>
       </w:r>
     </w:p>
     <w:p>
+      <w:pPr>
+        <w:jc w:val="both"/>
+      </w:pPr>
       <w:r>
         <w:pict w14:anchorId="483BD6F7">
-          <v:rect id="_x0000_i1168" style="width:0;height:1.5pt" o:hralign="center" o:hrstd="t" o:hr="t" fillcolor="#a0a0a0" stroked="f"/>
+          <v:rect id="_x0000_i1028" style="width:0;height:1.5pt" o:hralign="center" o:hrstd="t" o:hr="t" fillcolor="#a0a0a0" stroked="f"/>
         </w:pict>
       </w:r>
     </w:p>
     <w:p>
       <w:pPr>
+        <w:jc w:val="both"/>
         <w:rPr>
           <w:b/>
           <w:bCs/>
@@ -426,6 +475,7 @@
           <w:ilvl w:val="0"/>
           <w:numId w:val="22"/>
         </w:numPr>
+        <w:jc w:val="both"/>
       </w:pPr>
       <w:r>
         <w:t>Participants must adhere to all timelines, submission guidelines, and evaluation procedures.</w:t>
@@ -437,6 +487,7 @@
           <w:ilvl w:val="0"/>
           <w:numId w:val="22"/>
         </w:numPr>
+        <w:jc w:val="both"/>
       </w:pPr>
       <w:r>
         <w:t>Failure to comply with official instructions may result in penalties.</w:t>
@@ -448,20 +499,25 @@
           <w:ilvl w:val="0"/>
           <w:numId w:val="22"/>
         </w:numPr>
+        <w:jc w:val="both"/>
       </w:pPr>
       <w:r>
         <w:t>Organizers reserve the right to inspect project progress if required.</w:t>
       </w:r>
     </w:p>
     <w:p>
+      <w:pPr>
+        <w:jc w:val="both"/>
+      </w:pPr>
       <w:r>
         <w:pict w14:anchorId="3AB29003">
-          <v:rect id="_x0000_i1169" style="width:0;height:1.5pt" o:hralign="center" o:hrstd="t" o:hr="t" fillcolor="#a0a0a0" stroked="f"/>
+          <v:rect id="_x0000_i1029" style="width:0;height:1.5pt" o:hralign="center" o:hrstd="t" o:hr="t" fillcolor="#a0a0a0" stroked="f"/>
         </w:pict>
       </w:r>
     </w:p>
     <w:p>
       <w:pPr>
+        <w:jc w:val="both"/>
         <w:rPr>
           <w:b/>
           <w:bCs/>
@@ -481,6 +537,7 @@
           <w:ilvl w:val="0"/>
           <w:numId w:val="23"/>
         </w:numPr>
+        <w:jc w:val="both"/>
       </w:pPr>
       <w:r>
         <w:t>Any participant witnessing misconduct should immediately report it to the organizing committee.</w:t>
@@ -492,6 +549,7 @@
           <w:ilvl w:val="0"/>
           <w:numId w:val="23"/>
         </w:numPr>
+        <w:jc w:val="both"/>
       </w:pPr>
       <w:r>
         <w:t>Reports will be handled confidentially and investigated fairly.</w:t>
@@ -503,20 +561,25 @@
           <w:ilvl w:val="0"/>
           <w:numId w:val="23"/>
         </w:numPr>
+        <w:jc w:val="both"/>
       </w:pPr>
       <w:r>
         <w:t>Appropriate action will be taken based on the severity of the violation.</w:t>
       </w:r>
     </w:p>
     <w:p>
+      <w:pPr>
+        <w:jc w:val="both"/>
+      </w:pPr>
       <w:r>
         <w:pict w14:anchorId="6F4B9DAD">
-          <v:rect id="_x0000_i1170" style="width:0;height:1.5pt" o:hralign="center" o:hrstd="t" o:hr="t" fillcolor="#a0a0a0" stroked="f"/>
+          <v:rect id="_x0000_i1030" style="width:0;height:1.5pt" o:hralign="center" o:hrstd="t" o:hr="t" fillcolor="#a0a0a0" stroked="f"/>
         </w:pict>
       </w:r>
     </w:p>
     <w:p>
       <w:pPr>
+        <w:jc w:val="both"/>
         <w:rPr>
           <w:b/>
           <w:bCs/>
@@ -531,6 +594,9 @@
       </w:r>
     </w:p>
     <w:p>
+      <w:pPr>
+        <w:jc w:val="both"/>
+      </w:pPr>
       <w:r>
         <w:t>Violation of this Code of Conduct may result in:</w:t>
       </w:r>
@@ -541,6 +607,7 @@
           <w:ilvl w:val="0"/>
           <w:numId w:val="24"/>
         </w:numPr>
+        <w:jc w:val="both"/>
       </w:pPr>
       <w:r>
         <w:t>Verbal or written warning</w:t>
@@ -552,6 +619,7 @@
           <w:ilvl w:val="0"/>
           <w:numId w:val="24"/>
         </w:numPr>
+        <w:jc w:val="both"/>
       </w:pPr>
       <w:r>
         <w:t>Deduction of evaluation marks</w:t>
@@ -563,6 +631,7 @@
           <w:ilvl w:val="0"/>
           <w:numId w:val="24"/>
         </w:numPr>
+        <w:jc w:val="both"/>
       </w:pPr>
       <w:r>
         <w:t>Disqualification from the hackathon</w:t>
@@ -574,6 +643,7 @@
           <w:ilvl w:val="0"/>
           <w:numId w:val="24"/>
         </w:numPr>
+        <w:jc w:val="both"/>
       </w:pPr>
       <w:r>
         <w:t>Removal from the event venue</w:t>
@@ -585,20 +655,25 @@
           <w:ilvl w:val="0"/>
           <w:numId w:val="24"/>
         </w:numPr>
+        <w:jc w:val="both"/>
       </w:pPr>
       <w:r>
         <w:t>Cancellation of participation certificate</w:t>
       </w:r>
     </w:p>
     <w:p>
+      <w:pPr>
+        <w:jc w:val="both"/>
+      </w:pPr>
       <w:r>
         <w:pict w14:anchorId="42ECE6D7">
-          <v:rect id="_x0000_i1171" style="width:0;height:1.5pt" o:hralign="center" o:hrstd="t" o:hr="t" fillcolor="#a0a0a0" stroked="f"/>
+          <v:rect id="_x0000_i1031" style="width:0;height:1.5pt" o:hralign="center" o:hrstd="t" o:hr="t" fillcolor="#a0a0a0" stroked="f"/>
         </w:pict>
       </w:r>
     </w:p>
     <w:p>
       <w:pPr>
+        <w:jc w:val="both"/>
         <w:rPr>
           <w:b/>
           <w:bCs/>
@@ -613,19 +688,26 @@
       </w:r>
     </w:p>
     <w:p>
+      <w:pPr>
+        <w:jc w:val="both"/>
+      </w:pPr>
       <w:r>
         <w:t>All decisions taken by the Organizing Committee regarding discipline, evaluation, and conduct shall be final and binding.</w:t>
       </w:r>
     </w:p>
     <w:p>
+      <w:pPr>
+        <w:jc w:val="both"/>
+      </w:pPr>
       <w:r>
         <w:pict w14:anchorId="15609CA7">
-          <v:rect id="_x0000_i1172" style="width:0;height:1.5pt" o:hralign="center" o:hrstd="t" o:hr="t" fillcolor="#a0a0a0" stroked="f"/>
+          <v:rect id="_x0000_i1032" style="width:0;height:1.5pt" o:hralign="center" o:hrstd="t" o:hr="t" fillcolor="#a0a0a0" stroked="f"/>
         </w:pict>
       </w:r>
     </w:p>
     <w:p>
       <w:pPr>
+        <w:jc w:val="both"/>
         <w:rPr>
           <w:b/>
           <w:bCs/>
@@ -648,6 +730,9 @@
       </w:r>
     </w:p>
     <w:p>
+      <w:pPr>
+        <w:jc w:val="both"/>
+      </w:pPr>
       <w:r>
         <w:t xml:space="preserve">By registering for KBT </w:t>
       </w:r>
@@ -660,7 +745,11 @@
         <w:t>, participants agree to abide by this Code of Conduct and all hackathon rules.</w:t>
       </w:r>
     </w:p>
-    <w:p/>
+    <w:p>
+      <w:pPr>
+        <w:jc w:val="both"/>
+      </w:pPr>
+    </w:p>
     <w:sectPr>
       <w:pgSz w:w="11906" w:h="16838"/>
       <w:pgMar w:top="1440" w:right="1440" w:bottom="1440" w:left="1440" w:header="708" w:footer="708" w:gutter="0"/>
@@ -4715,6 +4804,7 @@
   <w:style w:type="character" w:default="1" w:styleId="DefaultParagraphFont">
     <w:name w:val="Default Paragraph Font"/>
     <w:uiPriority w:val="1"/>
+    <w:semiHidden/>
     <w:unhideWhenUsed/>
   </w:style>
   <w:style w:type="table" w:default="1" w:styleId="TableNormal">

</xml_diff>